<commit_message>
FCT ajout d’un contrôleur Restaurant avec ses vues et configuration de EntityFramework
</commit_message>
<xml_diff>
--- a/S10_Lab2_Instructions.docx
+++ b/S10_Lab2_Instructions.docx
@@ -666,7 +666,15 @@
         <w:t xml:space="preserve">ion à la BD </w:t>
       </w:r>
       <w:r>
-        <w:t>dans appsettings.json (Donc toutes les choses que vous aviez faite</w:t>
+        <w:t xml:space="preserve">dans </w:t>
+      </w:r>
+      <w:proofErr w:type="gramStart"/>
+      <w:r>
+        <w:t>appsettings.json</w:t>
+      </w:r>
+      <w:proofErr w:type="gramEnd"/>
+      <w:r>
+        <w:t xml:space="preserve"> (Donc toutes les choses que vous aviez faite</w:t>
       </w:r>
       <w:r>
         <w:t>s</w:t>
@@ -743,12 +751,28 @@
         </w:rPr>
         <w:t>/</w:t>
       </w:r>
+      <w:proofErr w:type="gramStart"/>
       <w:r>
         <w:rPr>
           <w:b/>
           <w:bCs/>
         </w:rPr>
         <w:t>Restaurants</w:t>
+      </w:r>
+      <w:r>
+        <w:rPr>
+          <w:b/>
+          <w:bCs/>
+        </w:rPr>
+        <w:t xml:space="preserve">  (</w:t>
+      </w:r>
+      <w:proofErr w:type="gramEnd"/>
+      <w:r>
+        <w:rPr>
+          <w:b/>
+          <w:bCs/>
+        </w:rPr>
+        <w:t>assurer meme nom views)</w:t>
       </w:r>
     </w:p>
     <w:p>
@@ -824,13 +848,21 @@
         <w:t>Bon,</w:t>
       </w:r>
       <w:r>
-        <w:t xml:space="preserve"> la création ne fonctionne pas et on n’a pas d’erreur</w:t>
+        <w:t xml:space="preserve"> la création ne fonctionne pas et on n’a pas </w:t>
+      </w:r>
+      <w:proofErr w:type="gramStart"/>
+      <w:r>
+        <w:t>d’erreur</w:t>
       </w:r>
       <w:r>
         <w:t>!</w:t>
       </w:r>
       <w:r>
-        <w:t xml:space="preserve">! C’est le moment de mettre un breakpoint dans la méthode [HttpPost] Create du contrôleur et de vérifier le </w:t>
+        <w:t>!</w:t>
+      </w:r>
+      <w:proofErr w:type="gramEnd"/>
+      <w:r>
+        <w:t xml:space="preserve"> C’est le moment de mettre un breakpoint dans la méthode [HttpPost] Create du contrôleur et de vérifier le </w:t>
       </w:r>
       <w:r>
         <w:rPr>
@@ -2590,13 +2622,23 @@
           <w:lang w:val="fr-CA"/>
         </w:rPr>
       </w:pPr>
-      <w:r>
-        <w:rPr>
-          <w:sz w:val="20"/>
-          <w:szCs w:val="20"/>
-          <w:lang w:val="fr-CA"/>
-        </w:rPr>
-        <w:t>namespace GenerationControleurs.ViewModels</w:t>
+      <w:proofErr w:type="gramStart"/>
+      <w:r>
+        <w:rPr>
+          <w:sz w:val="20"/>
+          <w:szCs w:val="20"/>
+          <w:lang w:val="fr-CA"/>
+        </w:rPr>
+        <w:t>namespace</w:t>
+      </w:r>
+      <w:proofErr w:type="gramEnd"/>
+      <w:r>
+        <w:rPr>
+          <w:sz w:val="20"/>
+          <w:szCs w:val="20"/>
+          <w:lang w:val="fr-CA"/>
+        </w:rPr>
+        <w:t xml:space="preserve"> GenerationControleurs.ViewModels</w:t>
       </w:r>
     </w:p>
     <w:p>
@@ -2632,7 +2674,25 @@
           <w:szCs w:val="20"/>
           <w:lang w:val="fr-CA"/>
         </w:rPr>
-        <w:t xml:space="preserve">    public class RestaurantsStatsVM</w:t>
+        <w:t xml:space="preserve">    </w:t>
+      </w:r>
+      <w:proofErr w:type="gramStart"/>
+      <w:r>
+        <w:rPr>
+          <w:sz w:val="20"/>
+          <w:szCs w:val="20"/>
+          <w:lang w:val="fr-CA"/>
+        </w:rPr>
+        <w:t>public</w:t>
+      </w:r>
+      <w:proofErr w:type="gramEnd"/>
+      <w:r>
+        <w:rPr>
+          <w:sz w:val="20"/>
+          <w:szCs w:val="20"/>
+          <w:lang w:val="fr-CA"/>
+        </w:rPr>
+        <w:t xml:space="preserve"> class RestaurantsStatsVM</w:t>
       </w:r>
     </w:p>
     <w:p>
@@ -2668,7 +2728,43 @@
           <w:szCs w:val="20"/>
           <w:lang w:val="fr-CA"/>
         </w:rPr>
-        <w:t xml:space="preserve">        public RestaurantsStatsVM(IEnumerable&lt;Restaurant&gt; restaurants)</w:t>
+        <w:t xml:space="preserve">        </w:t>
+      </w:r>
+      <w:proofErr w:type="gramStart"/>
+      <w:r>
+        <w:rPr>
+          <w:sz w:val="20"/>
+          <w:szCs w:val="20"/>
+          <w:lang w:val="fr-CA"/>
+        </w:rPr>
+        <w:t>public</w:t>
+      </w:r>
+      <w:proofErr w:type="gramEnd"/>
+      <w:r>
+        <w:rPr>
+          <w:sz w:val="20"/>
+          <w:szCs w:val="20"/>
+          <w:lang w:val="fr-CA"/>
+        </w:rPr>
+        <w:t xml:space="preserve"> </w:t>
+      </w:r>
+      <w:proofErr w:type="gramStart"/>
+      <w:r>
+        <w:rPr>
+          <w:sz w:val="20"/>
+          <w:szCs w:val="20"/>
+          <w:lang w:val="fr-CA"/>
+        </w:rPr>
+        <w:t>RestaurantsStatsVM(</w:t>
+      </w:r>
+      <w:proofErr w:type="gramEnd"/>
+      <w:r>
+        <w:rPr>
+          <w:sz w:val="20"/>
+          <w:szCs w:val="20"/>
+          <w:lang w:val="fr-CA"/>
+        </w:rPr>
+        <w:t>IEnumerable&lt;Restaurant&gt; restaurants)</w:t>
       </w:r>
     </w:p>
     <w:p>
@@ -2771,8 +2867,33 @@
           <w:sz w:val="20"/>
           <w:szCs w:val="20"/>
         </w:rPr>
-        <w:t xml:space="preserve">        public int NbCommandes { get; set; }</w:t>
-      </w:r>
+        <w:t xml:space="preserve">        public int NbCommandes </w:t>
+      </w:r>
+      <w:proofErr w:type="gramStart"/>
+      <w:r>
+        <w:rPr>
+          <w:sz w:val="20"/>
+          <w:szCs w:val="20"/>
+        </w:rPr>
+        <w:t>{ get</w:t>
+      </w:r>
+      <w:proofErr w:type="gramEnd"/>
+      <w:r>
+        <w:rPr>
+          <w:sz w:val="20"/>
+          <w:szCs w:val="20"/>
+        </w:rPr>
+        <w:t>; set</w:t>
+      </w:r>
+      <w:proofErr w:type="gramStart"/>
+      <w:r>
+        <w:rPr>
+          <w:sz w:val="20"/>
+          <w:szCs w:val="20"/>
+        </w:rPr>
+        <w:t>; }</w:t>
+      </w:r>
+      <w:proofErr w:type="gramEnd"/>
     </w:p>
     <w:p>
       <w:pPr>
@@ -2787,8 +2908,33 @@
           <w:sz w:val="20"/>
           <w:szCs w:val="20"/>
         </w:rPr>
-        <w:t xml:space="preserve">        public int NbPlatsVendus { get; set; }</w:t>
-      </w:r>
+        <w:t xml:space="preserve">        public int NbPlatsVendus </w:t>
+      </w:r>
+      <w:proofErr w:type="gramStart"/>
+      <w:r>
+        <w:rPr>
+          <w:sz w:val="20"/>
+          <w:szCs w:val="20"/>
+        </w:rPr>
+        <w:t>{ get</w:t>
+      </w:r>
+      <w:proofErr w:type="gramEnd"/>
+      <w:r>
+        <w:rPr>
+          <w:sz w:val="20"/>
+          <w:szCs w:val="20"/>
+        </w:rPr>
+        <w:t>; set</w:t>
+      </w:r>
+      <w:proofErr w:type="gramStart"/>
+      <w:r>
+        <w:rPr>
+          <w:sz w:val="20"/>
+          <w:szCs w:val="20"/>
+        </w:rPr>
+        <w:t>; }</w:t>
+      </w:r>
+      <w:proofErr w:type="gramEnd"/>
     </w:p>
     <w:p>
       <w:pPr>
@@ -2803,8 +2949,33 @@
           <w:sz w:val="20"/>
           <w:szCs w:val="20"/>
         </w:rPr>
-        <w:t xml:space="preserve">        public decimal PrixTotalCommandes { get; set; }</w:t>
-      </w:r>
+        <w:t xml:space="preserve">        public decimal PrixTotalCommandes </w:t>
+      </w:r>
+      <w:proofErr w:type="gramStart"/>
+      <w:r>
+        <w:rPr>
+          <w:sz w:val="20"/>
+          <w:szCs w:val="20"/>
+        </w:rPr>
+        <w:t>{ get</w:t>
+      </w:r>
+      <w:proofErr w:type="gramEnd"/>
+      <w:r>
+        <w:rPr>
+          <w:sz w:val="20"/>
+          <w:szCs w:val="20"/>
+        </w:rPr>
+        <w:t>; set</w:t>
+      </w:r>
+      <w:proofErr w:type="gramStart"/>
+      <w:r>
+        <w:rPr>
+          <w:sz w:val="20"/>
+          <w:szCs w:val="20"/>
+        </w:rPr>
+        <w:t>; }</w:t>
+      </w:r>
+      <w:proofErr w:type="gramEnd"/>
     </w:p>
     <w:p>
       <w:pPr>
@@ -2819,8 +2990,33 @@
           <w:sz w:val="20"/>
           <w:szCs w:val="20"/>
         </w:rPr>
-        <w:t xml:space="preserve">        public decimal PrixMaxCommande { get; set; }</w:t>
-      </w:r>
+        <w:t xml:space="preserve">        public decimal PrixMaxCommande </w:t>
+      </w:r>
+      <w:proofErr w:type="gramStart"/>
+      <w:r>
+        <w:rPr>
+          <w:sz w:val="20"/>
+          <w:szCs w:val="20"/>
+        </w:rPr>
+        <w:t>{ get</w:t>
+      </w:r>
+      <w:proofErr w:type="gramEnd"/>
+      <w:r>
+        <w:rPr>
+          <w:sz w:val="20"/>
+          <w:szCs w:val="20"/>
+        </w:rPr>
+        <w:t>; set</w:t>
+      </w:r>
+      <w:proofErr w:type="gramStart"/>
+      <w:r>
+        <w:rPr>
+          <w:sz w:val="20"/>
+          <w:szCs w:val="20"/>
+        </w:rPr>
+        <w:t>; }</w:t>
+      </w:r>
+      <w:proofErr w:type="gramEnd"/>
     </w:p>
     <w:p>
       <w:pPr>
@@ -2835,8 +3031,33 @@
           <w:sz w:val="20"/>
           <w:szCs w:val="20"/>
         </w:rPr>
-        <w:t xml:space="preserve">        public int MaxNiveauPiquant { get; set; }</w:t>
-      </w:r>
+        <w:t xml:space="preserve">        public int MaxNiveauPiquant </w:t>
+      </w:r>
+      <w:proofErr w:type="gramStart"/>
+      <w:r>
+        <w:rPr>
+          <w:sz w:val="20"/>
+          <w:szCs w:val="20"/>
+        </w:rPr>
+        <w:t>{ get</w:t>
+      </w:r>
+      <w:proofErr w:type="gramEnd"/>
+      <w:r>
+        <w:rPr>
+          <w:sz w:val="20"/>
+          <w:szCs w:val="20"/>
+        </w:rPr>
+        <w:t>; set</w:t>
+      </w:r>
+      <w:proofErr w:type="gramStart"/>
+      <w:r>
+        <w:rPr>
+          <w:sz w:val="20"/>
+          <w:szCs w:val="20"/>
+        </w:rPr>
+        <w:t>; }</w:t>
+      </w:r>
+      <w:proofErr w:type="gramEnd"/>
     </w:p>
     <w:p>
       <w:pPr>
@@ -2860,8 +3081,33 @@
           <w:sz w:val="20"/>
           <w:szCs w:val="20"/>
         </w:rPr>
-        <w:t xml:space="preserve">        public IEnumerable&lt;RestaurantStatsVM&gt; RestaurantStatsVM { get; set; }</w:t>
-      </w:r>
+        <w:t xml:space="preserve">        public IEnumerable&lt;RestaurantStatsVM&gt; RestaurantStatsVM </w:t>
+      </w:r>
+      <w:proofErr w:type="gramStart"/>
+      <w:r>
+        <w:rPr>
+          <w:sz w:val="20"/>
+          <w:szCs w:val="20"/>
+        </w:rPr>
+        <w:t>{ get</w:t>
+      </w:r>
+      <w:proofErr w:type="gramEnd"/>
+      <w:r>
+        <w:rPr>
+          <w:sz w:val="20"/>
+          <w:szCs w:val="20"/>
+        </w:rPr>
+        <w:t>; set</w:t>
+      </w:r>
+      <w:proofErr w:type="gramStart"/>
+      <w:r>
+        <w:rPr>
+          <w:sz w:val="20"/>
+          <w:szCs w:val="20"/>
+        </w:rPr>
+        <w:t>; }</w:t>
+      </w:r>
+      <w:proofErr w:type="gramEnd"/>
     </w:p>
     <w:p>
       <w:pPr>
@@ -2916,13 +3162,23 @@
           <w:lang w:val="fr-CA"/>
         </w:rPr>
       </w:pPr>
-      <w:r>
-        <w:rPr>
-          <w:sz w:val="20"/>
-          <w:szCs w:val="20"/>
-          <w:lang w:val="fr-CA"/>
-        </w:rPr>
-        <w:t>namespace GenerationControleurs.ViewModels</w:t>
+      <w:proofErr w:type="gramStart"/>
+      <w:r>
+        <w:rPr>
+          <w:sz w:val="20"/>
+          <w:szCs w:val="20"/>
+          <w:lang w:val="fr-CA"/>
+        </w:rPr>
+        <w:t>namespace</w:t>
+      </w:r>
+      <w:proofErr w:type="gramEnd"/>
+      <w:r>
+        <w:rPr>
+          <w:sz w:val="20"/>
+          <w:szCs w:val="20"/>
+          <w:lang w:val="fr-CA"/>
+        </w:rPr>
+        <w:t xml:space="preserve"> GenerationControleurs.ViewModels</w:t>
       </w:r>
     </w:p>
     <w:p>
@@ -2958,7 +3214,25 @@
           <w:szCs w:val="20"/>
           <w:lang w:val="fr-CA"/>
         </w:rPr>
-        <w:t xml:space="preserve">    public class RestaurantStatsVM</w:t>
+        <w:t xml:space="preserve">    </w:t>
+      </w:r>
+      <w:proofErr w:type="gramStart"/>
+      <w:r>
+        <w:rPr>
+          <w:sz w:val="20"/>
+          <w:szCs w:val="20"/>
+          <w:lang w:val="fr-CA"/>
+        </w:rPr>
+        <w:t>public</w:t>
+      </w:r>
+      <w:proofErr w:type="gramEnd"/>
+      <w:r>
+        <w:rPr>
+          <w:sz w:val="20"/>
+          <w:szCs w:val="20"/>
+          <w:lang w:val="fr-CA"/>
+        </w:rPr>
+        <w:t xml:space="preserve"> class RestaurantStatsVM</w:t>
       </w:r>
     </w:p>
     <w:p>
@@ -2994,7 +3268,43 @@
           <w:szCs w:val="20"/>
           <w:lang w:val="fr-CA"/>
         </w:rPr>
-        <w:t xml:space="preserve">        public RestaurantStatsVM(Restaurant restaurant)</w:t>
+        <w:t xml:space="preserve">        </w:t>
+      </w:r>
+      <w:proofErr w:type="gramStart"/>
+      <w:r>
+        <w:rPr>
+          <w:sz w:val="20"/>
+          <w:szCs w:val="20"/>
+          <w:lang w:val="fr-CA"/>
+        </w:rPr>
+        <w:t>public</w:t>
+      </w:r>
+      <w:proofErr w:type="gramEnd"/>
+      <w:r>
+        <w:rPr>
+          <w:sz w:val="20"/>
+          <w:szCs w:val="20"/>
+          <w:lang w:val="fr-CA"/>
+        </w:rPr>
+        <w:t xml:space="preserve"> </w:t>
+      </w:r>
+      <w:proofErr w:type="gramStart"/>
+      <w:r>
+        <w:rPr>
+          <w:sz w:val="20"/>
+          <w:szCs w:val="20"/>
+          <w:lang w:val="fr-CA"/>
+        </w:rPr>
+        <w:t>RestaurantStatsVM(</w:t>
+      </w:r>
+      <w:proofErr w:type="gramEnd"/>
+      <w:r>
+        <w:rPr>
+          <w:sz w:val="20"/>
+          <w:szCs w:val="20"/>
+          <w:lang w:val="fr-CA"/>
+        </w:rPr>
+        <w:t>Restaurant restaurant)</w:t>
       </w:r>
     </w:p>
     <w:p>
@@ -3079,8 +3389,33 @@
           <w:sz w:val="20"/>
           <w:szCs w:val="20"/>
         </w:rPr>
-        <w:t xml:space="preserve">        public string Nom { get; set; }</w:t>
-      </w:r>
+        <w:t xml:space="preserve">        public string Nom </w:t>
+      </w:r>
+      <w:proofErr w:type="gramStart"/>
+      <w:r>
+        <w:rPr>
+          <w:sz w:val="20"/>
+          <w:szCs w:val="20"/>
+        </w:rPr>
+        <w:t>{ get</w:t>
+      </w:r>
+      <w:proofErr w:type="gramEnd"/>
+      <w:r>
+        <w:rPr>
+          <w:sz w:val="20"/>
+          <w:szCs w:val="20"/>
+        </w:rPr>
+        <w:t>; set</w:t>
+      </w:r>
+      <w:proofErr w:type="gramStart"/>
+      <w:r>
+        <w:rPr>
+          <w:sz w:val="20"/>
+          <w:szCs w:val="20"/>
+        </w:rPr>
+        <w:t>; }</w:t>
+      </w:r>
+      <w:proofErr w:type="gramEnd"/>
     </w:p>
     <w:p>
       <w:pPr>
@@ -3095,8 +3430,33 @@
           <w:sz w:val="20"/>
           <w:szCs w:val="20"/>
         </w:rPr>
-        <w:t xml:space="preserve">        public int NbCommandes { get; set; }</w:t>
-      </w:r>
+        <w:t xml:space="preserve">        public int NbCommandes </w:t>
+      </w:r>
+      <w:proofErr w:type="gramStart"/>
+      <w:r>
+        <w:rPr>
+          <w:sz w:val="20"/>
+          <w:szCs w:val="20"/>
+        </w:rPr>
+        <w:t>{ get</w:t>
+      </w:r>
+      <w:proofErr w:type="gramEnd"/>
+      <w:r>
+        <w:rPr>
+          <w:sz w:val="20"/>
+          <w:szCs w:val="20"/>
+        </w:rPr>
+        <w:t>; set</w:t>
+      </w:r>
+      <w:proofErr w:type="gramStart"/>
+      <w:r>
+        <w:rPr>
+          <w:sz w:val="20"/>
+          <w:szCs w:val="20"/>
+        </w:rPr>
+        <w:t>; }</w:t>
+      </w:r>
+      <w:proofErr w:type="gramEnd"/>
     </w:p>
     <w:p>
       <w:pPr>
@@ -3111,8 +3471,33 @@
           <w:sz w:val="20"/>
           <w:szCs w:val="20"/>
         </w:rPr>
-        <w:t xml:space="preserve">        public int NbPlatsVendus { get; set; }</w:t>
-      </w:r>
+        <w:t xml:space="preserve">        public int NbPlatsVendus </w:t>
+      </w:r>
+      <w:proofErr w:type="gramStart"/>
+      <w:r>
+        <w:rPr>
+          <w:sz w:val="20"/>
+          <w:szCs w:val="20"/>
+        </w:rPr>
+        <w:t>{ get</w:t>
+      </w:r>
+      <w:proofErr w:type="gramEnd"/>
+      <w:r>
+        <w:rPr>
+          <w:sz w:val="20"/>
+          <w:szCs w:val="20"/>
+        </w:rPr>
+        <w:t>; set</w:t>
+      </w:r>
+      <w:proofErr w:type="gramStart"/>
+      <w:r>
+        <w:rPr>
+          <w:sz w:val="20"/>
+          <w:szCs w:val="20"/>
+        </w:rPr>
+        <w:t>; }</w:t>
+      </w:r>
+      <w:proofErr w:type="gramEnd"/>
     </w:p>
     <w:p>
       <w:pPr>
@@ -3127,8 +3512,33 @@
           <w:sz w:val="20"/>
           <w:szCs w:val="20"/>
         </w:rPr>
-        <w:t xml:space="preserve">        public decimal PrixTotalCommandes { get; set; }</w:t>
-      </w:r>
+        <w:t xml:space="preserve">        public decimal PrixTotalCommandes </w:t>
+      </w:r>
+      <w:proofErr w:type="gramStart"/>
+      <w:r>
+        <w:rPr>
+          <w:sz w:val="20"/>
+          <w:szCs w:val="20"/>
+        </w:rPr>
+        <w:t>{ get</w:t>
+      </w:r>
+      <w:proofErr w:type="gramEnd"/>
+      <w:r>
+        <w:rPr>
+          <w:sz w:val="20"/>
+          <w:szCs w:val="20"/>
+        </w:rPr>
+        <w:t>; set</w:t>
+      </w:r>
+      <w:proofErr w:type="gramStart"/>
+      <w:r>
+        <w:rPr>
+          <w:sz w:val="20"/>
+          <w:szCs w:val="20"/>
+        </w:rPr>
+        <w:t>; }</w:t>
+      </w:r>
+      <w:proofErr w:type="gramEnd"/>
     </w:p>
     <w:p>
       <w:pPr>
@@ -3143,8 +3553,33 @@
           <w:sz w:val="20"/>
           <w:szCs w:val="20"/>
         </w:rPr>
-        <w:t xml:space="preserve">        public decimal PrixMaxCommande { get; set; }</w:t>
-      </w:r>
+        <w:t xml:space="preserve">        public decimal PrixMaxCommande </w:t>
+      </w:r>
+      <w:proofErr w:type="gramStart"/>
+      <w:r>
+        <w:rPr>
+          <w:sz w:val="20"/>
+          <w:szCs w:val="20"/>
+        </w:rPr>
+        <w:t>{ get</w:t>
+      </w:r>
+      <w:proofErr w:type="gramEnd"/>
+      <w:r>
+        <w:rPr>
+          <w:sz w:val="20"/>
+          <w:szCs w:val="20"/>
+        </w:rPr>
+        <w:t>; set</w:t>
+      </w:r>
+      <w:proofErr w:type="gramStart"/>
+      <w:r>
+        <w:rPr>
+          <w:sz w:val="20"/>
+          <w:szCs w:val="20"/>
+        </w:rPr>
+        <w:t>; }</w:t>
+      </w:r>
+      <w:proofErr w:type="gramEnd"/>
     </w:p>
     <w:p>
       <w:pPr>
@@ -3159,8 +3594,33 @@
           <w:sz w:val="20"/>
           <w:szCs w:val="20"/>
         </w:rPr>
-        <w:t xml:space="preserve">        public int MaxNiveauPiquant { get; set; }</w:t>
-      </w:r>
+        <w:t xml:space="preserve">        public int MaxNiveauPiquant </w:t>
+      </w:r>
+      <w:proofErr w:type="gramStart"/>
+      <w:r>
+        <w:rPr>
+          <w:sz w:val="20"/>
+          <w:szCs w:val="20"/>
+        </w:rPr>
+        <w:t>{ get</w:t>
+      </w:r>
+      <w:proofErr w:type="gramEnd"/>
+      <w:r>
+        <w:rPr>
+          <w:sz w:val="20"/>
+          <w:szCs w:val="20"/>
+        </w:rPr>
+        <w:t>; set</w:t>
+      </w:r>
+      <w:proofErr w:type="gramStart"/>
+      <w:r>
+        <w:rPr>
+          <w:sz w:val="20"/>
+          <w:szCs w:val="20"/>
+        </w:rPr>
+        <w:t>; }</w:t>
+      </w:r>
+      <w:proofErr w:type="gramEnd"/>
     </w:p>
     <w:p>
       <w:pPr>
@@ -3216,7 +3676,23 @@
         </w:numPr>
       </w:pPr>
       <w:r>
-        <w:t>Vous allez avoir besoin de .Include et .ThenInclude dans le contrôleur pour charger les propriétés.</w:t>
+        <w:t xml:space="preserve">Vous allez avoir besoin </w:t>
+      </w:r>
+      <w:proofErr w:type="gramStart"/>
+      <w:r>
+        <w:t>de .Include</w:t>
+      </w:r>
+      <w:proofErr w:type="gramEnd"/>
+      <w:r>
+        <w:t xml:space="preserve"> </w:t>
+      </w:r>
+      <w:proofErr w:type="gramStart"/>
+      <w:r>
+        <w:t>et .ThenInclude</w:t>
+      </w:r>
+      <w:proofErr w:type="gramEnd"/>
+      <w:r>
+        <w:t xml:space="preserve"> dans le contrôleur pour charger les propriétés.</w:t>
       </w:r>
     </w:p>
     <w:p>
@@ -3246,7 +3722,15 @@
         </w:numPr>
       </w:pPr>
       <w:r>
-        <w:t>Le champ NiveauPiquant a un ?, regardez les notes de cours pour voir comment on peut utiliser Linq dans ce cas.</w:t>
+        <w:t xml:space="preserve">Le champ NiveauPiquant a </w:t>
+      </w:r>
+      <w:proofErr w:type="gramStart"/>
+      <w:r>
+        <w:t>un ?,</w:t>
+      </w:r>
+      <w:proofErr w:type="gramEnd"/>
+      <w:r>
+        <w:t xml:space="preserve"> regardez les notes de cours pour voir comment on peut utiliser Linq dans ce cas.</w:t>
       </w:r>
     </w:p>
     <w:p>
@@ -6670,6 +7154,7 @@
   <w:style w:type="character" w:default="1" w:styleId="Policepardfaut">
     <w:name w:val="Default Paragraph Font"/>
     <w:uiPriority w:val="1"/>
+    <w:semiHidden/>
     <w:unhideWhenUsed/>
   </w:style>
   <w:style w:type="table" w:default="1" w:styleId="TableauNormal">
@@ -7207,7 +7692,7 @@
       <w:szCs w:val="21"/>
     </w:rPr>
   </w:style>
-  <w:style w:type="character" w:styleId="Lienhypertexte">
+  <w:style w:type="character" w:styleId="Hyperlien">
     <w:name w:val="Hyperlink"/>
     <w:basedOn w:val="Policepardfaut"/>
     <w:uiPriority w:val="99"/>
@@ -7688,6 +8173,12 @@
 </file>
 
 <file path=customXml/item1.xml><?xml version="1.0" encoding="utf-8"?>
+<p:properties xmlns:p="http://schemas.microsoft.com/office/2006/metadata/properties" xmlns:xsi="http://www.w3.org/2001/XMLSchema-instance" xmlns:pc="http://schemas.microsoft.com/office/infopath/2007/PartnerControls">
+  <documentManagement/>
+</p:properties>
+</file>
+
+<file path=customXml/item2.xml><?xml version="1.0" encoding="utf-8"?>
 <?mso-contentType ?>
 <FormTemplates xmlns="http://schemas.microsoft.com/sharepoint/v3/contenttype/forms">
   <Display>DocumentLibraryForm</Display>
@@ -7696,13 +8187,11 @@
 </FormTemplates>
 </file>
 
-<file path=customXml/item2.xml><?xml version="1.0" encoding="utf-8"?>
-<p:properties xmlns:p="http://schemas.microsoft.com/office/2006/metadata/properties" xmlns:xsi="http://www.w3.org/2001/XMLSchema-instance" xmlns:pc="http://schemas.microsoft.com/office/infopath/2007/PartnerControls">
-  <documentManagement/>
-</p:properties>
+<file path=customXml/item3.xml><?xml version="1.0" encoding="utf-8"?>
+<b:Sources xmlns:b="http://schemas.openxmlformats.org/officeDocument/2006/bibliography" xmlns="http://schemas.openxmlformats.org/officeDocument/2006/bibliography" SelectedStyle="\APASixthEditionOfficeOnline.xsl" StyleName="APA" Version="6"/>
 </file>
 
-<file path=customXml/item3.xml><?xml version="1.0" encoding="utf-8"?>
+<file path=customXml/item4.xml><?xml version="1.0" encoding="utf-8"?>
 <ct:contentTypeSchema xmlns:ct="http://schemas.microsoft.com/office/2006/metadata/contentType" xmlns:ma="http://schemas.microsoft.com/office/2006/metadata/properties/metaAttributes" ct:_="" ma:_="" ma:contentTypeName="Document" ma:contentTypeID="0x010100354AEAE9FD62D747A26A546E5B1B5735" ma:contentTypeVersion="7" ma:contentTypeDescription="Crée un document." ma:contentTypeScope="" ma:versionID="43b763fe9aa20b7a2976a5e019d82dbf">
   <xsd:schema xmlns:xsd="http://www.w3.org/2001/XMLSchema" xmlns:xs="http://www.w3.org/2001/XMLSchema" xmlns:p="http://schemas.microsoft.com/office/2006/metadata/properties" xmlns:ns2="071933db-0376-4694-9786-b56cb37c4ec2" targetNamespace="http://schemas.microsoft.com/office/2006/metadata/properties" ma:root="true" ma:fieldsID="d5c90ae6c1ec6ed317c9f5feddaf7a33" ns2:_="">
     <xsd:import namespace="071933db-0376-4694-9786-b56cb37c4ec2"/>
@@ -7866,19 +8355,7 @@
 </ct:contentTypeSchema>
 </file>
 
-<file path=customXml/item4.xml><?xml version="1.0" encoding="utf-8"?>
-<b:Sources xmlns:b="http://schemas.openxmlformats.org/officeDocument/2006/bibliography" xmlns="http://schemas.openxmlformats.org/officeDocument/2006/bibliography" SelectedStyle="\APASixthEditionOfficeOnline.xsl" StyleName="APA" Version="6"/>
-</file>
-
 <file path=customXml/itemProps1.xml><?xml version="1.0" encoding="utf-8"?>
-<ds:datastoreItem xmlns:ds="http://schemas.openxmlformats.org/officeDocument/2006/customXml" ds:itemID="{F6194C16-5FE5-4670-BEC8-3D6DD9380312}">
-  <ds:schemaRefs>
-    <ds:schemaRef ds:uri="http://schemas.microsoft.com/sharepoint/v3/contenttype/forms"/>
-  </ds:schemaRefs>
-</ds:datastoreItem>
-</file>
-
-<file path=customXml/itemProps2.xml><?xml version="1.0" encoding="utf-8"?>
 <ds:datastoreItem xmlns:ds="http://schemas.openxmlformats.org/officeDocument/2006/customXml" ds:itemID="{2C36E056-BA2C-4A1F-9580-242C9B36FE70}">
   <ds:schemaRefs>
     <ds:schemaRef ds:uri="http://schemas.microsoft.com/office/2006/metadata/properties"/>
@@ -7887,7 +8364,23 @@
 </ds:datastoreItem>
 </file>
 
+<file path=customXml/itemProps2.xml><?xml version="1.0" encoding="utf-8"?>
+<ds:datastoreItem xmlns:ds="http://schemas.openxmlformats.org/officeDocument/2006/customXml" ds:itemID="{F6194C16-5FE5-4670-BEC8-3D6DD9380312}">
+  <ds:schemaRefs>
+    <ds:schemaRef ds:uri="http://schemas.microsoft.com/sharepoint/v3/contenttype/forms"/>
+  </ds:schemaRefs>
+</ds:datastoreItem>
+</file>
+
 <file path=customXml/itemProps3.xml><?xml version="1.0" encoding="utf-8"?>
+<ds:datastoreItem xmlns:ds="http://schemas.openxmlformats.org/officeDocument/2006/customXml" ds:itemID="{28D15B86-D92D-420E-A893-C7613CFD01AE}">
+  <ds:schemaRefs>
+    <ds:schemaRef ds:uri="http://schemas.openxmlformats.org/officeDocument/2006/bibliography"/>
+  </ds:schemaRefs>
+</ds:datastoreItem>
+</file>
+
+<file path=customXml/itemProps4.xml><?xml version="1.0" encoding="utf-8"?>
 <ds:datastoreItem xmlns:ds="http://schemas.openxmlformats.org/officeDocument/2006/customXml" ds:itemID="{5C3A06EC-DC03-4D65-AA15-C6B9D68C1ED0}">
   <ds:schemaRefs>
     <ds:schemaRef ds:uri="http://schemas.microsoft.com/office/2006/metadata/contentType"/>
@@ -7903,12 +8396,4 @@
     <ds:schemaRef ds:uri="http://schemas.microsoft.com/internal/obd"/>
   </ds:schemaRefs>
 </ds:datastoreItem>
-</file>
-
-<file path=customXml/itemProps4.xml><?xml version="1.0" encoding="utf-8"?>
-<ds:datastoreItem xmlns:ds="http://schemas.openxmlformats.org/officeDocument/2006/customXml" ds:itemID="{28D15B86-D92D-420E-A893-C7613CFD01AE}">
-  <ds:schemaRefs>
-    <ds:schemaRef ds:uri="http://schemas.openxmlformats.org/officeDocument/2006/bibliography"/>
-  </ds:schemaRefs>
-</ds:datastoreItem>
 </file>
</xml_diff>